<commit_message>
Faire attention au serveur que je mets
</commit_message>
<xml_diff>
--- a/S12_Lab1_Instructions.docx
+++ b/S12_Lab1_Instructions.docx
@@ -404,6 +404,9 @@
         <w:jc w:val="center"/>
       </w:pPr>
       <w:r>
+        <w:rPr>
+          <w:noProof/>
+        </w:rPr>
         <w:drawing>
           <wp:inline distT="0" distB="0" distL="0" distR="0" wp14:anchorId="6813A798" wp14:editId="04AA6DFC">
             <wp:extent cx="5557589" cy="3103418"/>
@@ -691,6 +694,70 @@
         </w:rPr>
         <w:t>Comment corriger cette erreur?</w:t>
       </w:r>
+      <w:r>
+        <w:rPr>
+          <w:b/>
+          <w:bCs/>
+          <w:i/>
+          <w:iCs/>
+          <w:color w:val="C00000"/>
+          <w:sz w:val="32"/>
+          <w:szCs w:val="32"/>
+        </w:rPr>
+        <w:t xml:space="preserve"> Il faut juste changé le chemin de la </w:t>
+      </w:r>
+      <w:proofErr w:type="spellStart"/>
+      <w:r>
+        <w:rPr>
+          <w:b/>
+          <w:bCs/>
+          <w:i/>
+          <w:iCs/>
+          <w:color w:val="C00000"/>
+          <w:sz w:val="32"/>
+          <w:szCs w:val="32"/>
+        </w:rPr>
+        <w:t>connection</w:t>
+      </w:r>
+      <w:proofErr w:type="spellEnd"/>
+      <w:r>
+        <w:rPr>
+          <w:b/>
+          <w:bCs/>
+          <w:i/>
+          <w:iCs/>
+          <w:color w:val="C00000"/>
+          <w:sz w:val="32"/>
+          <w:szCs w:val="32"/>
+        </w:rPr>
+        <w:t xml:space="preserve"> au server SQL. Dans le fichier </w:t>
+      </w:r>
+      <w:proofErr w:type="spellStart"/>
+      <w:r>
+        <w:rPr>
+          <w:b/>
+          <w:bCs/>
+          <w:i/>
+          <w:iCs/>
+          <w:color w:val="C00000"/>
+          <w:sz w:val="32"/>
+          <w:szCs w:val="32"/>
+        </w:rPr>
+        <w:t>appjson</w:t>
+      </w:r>
+      <w:proofErr w:type="spellEnd"/>
+      <w:r>
+        <w:rPr>
+          <w:b/>
+          <w:bCs/>
+          <w:i/>
+          <w:iCs/>
+          <w:color w:val="C00000"/>
+          <w:sz w:val="32"/>
+          <w:szCs w:val="32"/>
+        </w:rPr>
+        <w:t>…</w:t>
+      </w:r>
     </w:p>
     <w:p>
       <w:pPr>
@@ -950,6 +1017,166 @@
         </w:rPr>
         <w:t>?</w:t>
       </w:r>
+      <w:r>
+        <w:rPr>
+          <w:b/>
+          <w:bCs/>
+          <w:i/>
+          <w:iCs/>
+          <w:color w:val="C00000"/>
+          <w:sz w:val="32"/>
+          <w:szCs w:val="32"/>
+        </w:rPr>
+        <w:t xml:space="preserve"> Il fallait juste rajouter le produits dans le </w:t>
+      </w:r>
+      <w:proofErr w:type="spellStart"/>
+      <w:r>
+        <w:rPr>
+          <w:b/>
+          <w:bCs/>
+          <w:i/>
+          <w:iCs/>
+          <w:color w:val="C00000"/>
+          <w:sz w:val="32"/>
+          <w:szCs w:val="32"/>
+        </w:rPr>
+        <w:t>dbSet</w:t>
+      </w:r>
+      <w:proofErr w:type="spellEnd"/>
+      <w:r>
+        <w:rPr>
+          <w:b/>
+          <w:bCs/>
+          <w:i/>
+          <w:iCs/>
+          <w:color w:val="C00000"/>
+          <w:sz w:val="32"/>
+          <w:szCs w:val="32"/>
+        </w:rPr>
+        <w:t xml:space="preserve"> et ensuite l’envoyer </w:t>
+      </w:r>
+      <w:r>
+        <w:rPr>
+          <w:b/>
+          <w:bCs/>
+          <w:i/>
+          <w:iCs/>
+          <w:color w:val="C00000"/>
+          <w:sz w:val="32"/>
+          <w:szCs w:val="32"/>
+        </w:rPr>
+        <w:t xml:space="preserve">au </w:t>
+      </w:r>
+      <w:proofErr w:type="spellStart"/>
+      <w:r>
+        <w:rPr>
+          <w:b/>
+          <w:bCs/>
+          <w:i/>
+          <w:iCs/>
+          <w:color w:val="C00000"/>
+          <w:sz w:val="32"/>
+          <w:szCs w:val="32"/>
+        </w:rPr>
+        <w:t>controlleur</w:t>
+      </w:r>
+      <w:proofErr w:type="spellEnd"/>
+      <w:r>
+        <w:rPr>
+          <w:b/>
+          <w:bCs/>
+          <w:i/>
+          <w:iCs/>
+          <w:color w:val="C00000"/>
+          <w:sz w:val="32"/>
+          <w:szCs w:val="32"/>
+        </w:rPr>
+        <w:t xml:space="preserve"> </w:t>
+      </w:r>
+      <w:r>
+        <w:rPr>
+          <w:b/>
+          <w:bCs/>
+          <w:i/>
+          <w:iCs/>
+          <w:color w:val="C00000"/>
+          <w:sz w:val="32"/>
+          <w:szCs w:val="32"/>
+        </w:rPr>
+        <w:t>(</w:t>
+      </w:r>
+      <w:r>
+        <w:rPr>
+          <w:b/>
+          <w:bCs/>
+          <w:i/>
+          <w:iCs/>
+          <w:color w:val="C00000"/>
+          <w:sz w:val="32"/>
+          <w:szCs w:val="32"/>
+        </w:rPr>
+        <w:t>Produits</w:t>
+      </w:r>
+      <w:r>
+        <w:rPr>
+          <w:b/>
+          <w:bCs/>
+          <w:i/>
+          <w:iCs/>
+          <w:color w:val="C00000"/>
+          <w:sz w:val="32"/>
+          <w:szCs w:val="32"/>
+        </w:rPr>
+        <w:t>)</w:t>
+      </w:r>
+      <w:r>
+        <w:rPr>
+          <w:b/>
+          <w:bCs/>
+          <w:i/>
+          <w:iCs/>
+          <w:color w:val="C00000"/>
+          <w:sz w:val="32"/>
+          <w:szCs w:val="32"/>
+        </w:rPr>
+        <w:t xml:space="preserve"> de l’action</w:t>
+      </w:r>
+      <w:r>
+        <w:rPr>
+          <w:b/>
+          <w:bCs/>
+          <w:i/>
+          <w:iCs/>
+          <w:color w:val="C00000"/>
+          <w:sz w:val="32"/>
+          <w:szCs w:val="32"/>
+        </w:rPr>
+        <w:t xml:space="preserve"> index doit envoyé la liste de produit </w:t>
+      </w:r>
+      <w:r>
+        <w:rPr>
+          <w:b/>
+          <w:bCs/>
+          <w:i/>
+          <w:iCs/>
+          <w:color w:val="C00000"/>
+          <w:sz w:val="32"/>
+          <w:szCs w:val="32"/>
+        </w:rPr>
+        <w:t>à la vue index .</w:t>
+      </w:r>
+      <w:r>
+        <w:rPr>
+          <w:b/>
+          <w:bCs/>
+          <w:i/>
+          <w:iCs/>
+          <w:color w:val="C00000"/>
+          <w:sz w:val="32"/>
+          <w:szCs w:val="32"/>
+        </w:rPr>
+        <w:t xml:space="preserve"> </w:t>
+      </w:r>
     </w:p>
     <w:p>
       <w:pPr>
@@ -992,7 +1219,6 @@
         <w:pStyle w:val="Titre2"/>
       </w:pPr>
       <w:r>
-        <w:lastRenderedPageBreak/>
         <w:t xml:space="preserve">mission </w:t>
       </w:r>
       <w:r>
@@ -2008,20 +2234,8 @@
           <w:szCs w:val="28"/>
           <w:u w:val="single"/>
         </w:rPr>
-        <w:t xml:space="preserve">Missions </w:t>
-      </w:r>
-      <w:proofErr w:type="gramStart"/>
-      <w:r>
-        <w:rPr>
-          <w:b/>
-          <w:bCs/>
-          <w:sz w:val="28"/>
-          <w:szCs w:val="28"/>
-          <w:u w:val="single"/>
-        </w:rPr>
-        <w:t>accomplies!!!</w:t>
-      </w:r>
-      <w:proofErr w:type="gramEnd"/>
+        <w:t>Missions accomplies!!!</w:t>
+      </w:r>
     </w:p>
     <w:sectPr>
       <w:headerReference w:type="default" r:id="rId16"/>
@@ -8188,7 +8402,7 @@
       <w:szCs w:val="21"/>
     </w:rPr>
   </w:style>
-  <w:style w:type="character" w:styleId="Lienhypertexte">
+  <w:style w:type="character" w:styleId="Hyperlien">
     <w:name w:val="Hyperlink"/>
     <w:basedOn w:val="Policepardfaut"/>
     <w:uiPriority w:val="99"/>
@@ -8628,15 +8842,6 @@
 </file>
 
 <file path=customXml/item2.xml><?xml version="1.0" encoding="utf-8"?>
-<?mso-contentType ?>
-<FormTemplates xmlns="http://schemas.microsoft.com/sharepoint/v3/contenttype/forms">
-  <Display>DocumentLibraryForm</Display>
-  <Edit>DocumentLibraryForm</Edit>
-  <New>DocumentLibraryForm</New>
-</FormTemplates>
-</file>
-
-<file path=customXml/item3.xml><?xml version="1.0" encoding="utf-8"?>
 <ct:contentTypeSchema xmlns:ct="http://schemas.microsoft.com/office/2006/metadata/contentType" xmlns:ma="http://schemas.microsoft.com/office/2006/metadata/properties/metaAttributes" ct:_="" ma:_="" ma:contentTypeName="Document" ma:contentTypeID="0x010100354AEAE9FD62D747A26A546E5B1B5735" ma:contentTypeVersion="7" ma:contentTypeDescription="Crée un document." ma:contentTypeScope="" ma:versionID="43b763fe9aa20b7a2976a5e019d82dbf">
   <xsd:schema xmlns:xsd="http://www.w3.org/2001/XMLSchema" xmlns:xs="http://www.w3.org/2001/XMLSchema" xmlns:p="http://schemas.microsoft.com/office/2006/metadata/properties" xmlns:ns2="071933db-0376-4694-9786-b56cb37c4ec2" targetNamespace="http://schemas.microsoft.com/office/2006/metadata/properties" ma:root="true" ma:fieldsID="d5c90ae6c1ec6ed317c9f5feddaf7a33" ns2:_="">
     <xsd:import namespace="071933db-0376-4694-9786-b56cb37c4ec2"/>
@@ -8800,6 +9005,15 @@
 </ct:contentTypeSchema>
 </file>
 
+<file path=customXml/item3.xml><?xml version="1.0" encoding="utf-8"?>
+<?mso-contentType ?>
+<FormTemplates xmlns="http://schemas.microsoft.com/sharepoint/v3/contenttype/forms">
+  <Display>DocumentLibraryForm</Display>
+  <Edit>DocumentLibraryForm</Edit>
+  <New>DocumentLibraryForm</New>
+</FormTemplates>
+</file>
+
 <file path=customXml/itemProps1.xml><?xml version="1.0" encoding="utf-8"?>
 <ds:datastoreItem xmlns:ds="http://schemas.openxmlformats.org/officeDocument/2006/customXml" ds:itemID="{2C36E056-BA2C-4A1F-9580-242C9B36FE70}">
   <ds:schemaRefs>
@@ -8810,14 +9024,6 @@
 </file>
 
 <file path=customXml/itemProps2.xml><?xml version="1.0" encoding="utf-8"?>
-<ds:datastoreItem xmlns:ds="http://schemas.openxmlformats.org/officeDocument/2006/customXml" ds:itemID="{F6194C16-5FE5-4670-BEC8-3D6DD9380312}">
-  <ds:schemaRefs>
-    <ds:schemaRef ds:uri="http://schemas.microsoft.com/sharepoint/v3/contenttype/forms"/>
-  </ds:schemaRefs>
-</ds:datastoreItem>
-</file>
-
-<file path=customXml/itemProps3.xml><?xml version="1.0" encoding="utf-8"?>
 <ds:datastoreItem xmlns:ds="http://schemas.openxmlformats.org/officeDocument/2006/customXml" ds:itemID="{5C3A06EC-DC03-4D65-AA15-C6B9D68C1ED0}">
   <ds:schemaRefs>
     <ds:schemaRef ds:uri="http://schemas.microsoft.com/office/2006/metadata/contentType"/>
@@ -8833,4 +9039,12 @@
     <ds:schemaRef ds:uri="http://schemas.microsoft.com/internal/obd"/>
   </ds:schemaRefs>
 </ds:datastoreItem>
+</file>
+
+<file path=customXml/itemProps3.xml><?xml version="1.0" encoding="utf-8"?>
+<ds:datastoreItem xmlns:ds="http://schemas.openxmlformats.org/officeDocument/2006/customXml" ds:itemID="{F6194C16-5FE5-4670-BEC8-3D6DD9380312}">
+  <ds:schemaRefs>
+    <ds:schemaRef ds:uri="http://schemas.microsoft.com/sharepoint/v3/contenttype/forms"/>
+  </ds:schemaRefs>
+</ds:datastoreItem>
 </file>
</xml_diff>

<commit_message>
Modification de la vue ,du controller
Dans ma vue j'ai utiliser le préfixe produit car c'est celui qui permets d'avoir accès aux propriétés  de cette classe j'ai aussi changé le asp items pour Model.CategorieList afin d'afficher la liste des catégories . Dans mon controller j'ai modifié mon post Create car lorsque j'appuie sur le bouton il reset automatiquement tout la liste mais j'ai fais en sorte qu'elle reste en permanence.
</commit_message>
<xml_diff>
--- a/S12_Lab1_Instructions.docx
+++ b/S12_Lab1_Instructions.docx
@@ -615,8 +615,9 @@
           <w:bCs/>
           <w:i/>
           <w:iCs/>
-          <w:sz w:val="28"/>
-          <w:szCs w:val="28"/>
+          <w:color w:val="C00000"/>
+          <w:sz w:val="32"/>
+          <w:szCs w:val="32"/>
         </w:rPr>
       </w:pPr>
       <w:r>
@@ -694,6 +695,19 @@
         </w:rPr>
         <w:t>Comment corriger cette erreur?</w:t>
       </w:r>
+    </w:p>
+    <w:p>
+      <w:pPr>
+        <w:spacing w:before="0" w:after="160" w:line="259" w:lineRule="auto"/>
+        <w:rPr>
+          <w:b/>
+          <w:bCs/>
+          <w:i/>
+          <w:iCs/>
+          <w:sz w:val="28"/>
+          <w:szCs w:val="28"/>
+        </w:rPr>
+      </w:pPr>
       <w:r>
         <w:rPr>
           <w:b/>
@@ -1040,6 +1054,7 @@
           <w:sz w:val="32"/>
           <w:szCs w:val="32"/>
         </w:rPr>
+        <w:lastRenderedPageBreak/>
         <w:t>dbSet</w:t>
       </w:r>
       <w:proofErr w:type="spellEnd"/>
@@ -1861,7 +1876,33 @@
           <w:sz w:val="32"/>
           <w:szCs w:val="32"/>
         </w:rPr>
-        <w:t xml:space="preserve">Utilisez la le </w:t>
+        <w:t xml:space="preserve">Utilisez </w:t>
+      </w:r>
+      <w:proofErr w:type="spellStart"/>
+      <w:r>
+        <w:rPr>
+          <w:b/>
+          <w:bCs/>
+          <w:i/>
+          <w:iCs/>
+          <w:color w:val="C00000"/>
+          <w:sz w:val="32"/>
+          <w:szCs w:val="32"/>
+        </w:rPr>
+        <w:t>la</w:t>
+      </w:r>
+      <w:proofErr w:type="spellEnd"/>
+      <w:r>
+        <w:rPr>
+          <w:b/>
+          <w:bCs/>
+          <w:i/>
+          <w:iCs/>
+          <w:color w:val="C00000"/>
+          <w:sz w:val="32"/>
+          <w:szCs w:val="32"/>
+        </w:rPr>
+        <w:t xml:space="preserve"> le </w:t>
       </w:r>
       <w:proofErr w:type="spellStart"/>
       <w:r>
@@ -2520,6 +2561,177 @@
           <w:szCs w:val="32"/>
         </w:rPr>
         <w:t>Comment corriger cette erreur?</w:t>
+      </w:r>
+      <w:r>
+        <w:t xml:space="preserve"> </w:t>
+      </w:r>
+      <w:r>
+        <w:rPr>
+          <w:b/>
+          <w:bCs/>
+          <w:i/>
+          <w:iCs/>
+          <w:color w:val="C00000"/>
+          <w:sz w:val="32"/>
+          <w:szCs w:val="32"/>
+        </w:rPr>
+        <w:t xml:space="preserve">Dans ma vue j'ai </w:t>
+      </w:r>
+      <w:proofErr w:type="spellStart"/>
+      <w:r>
+        <w:rPr>
+          <w:b/>
+          <w:bCs/>
+          <w:i/>
+          <w:iCs/>
+          <w:color w:val="C00000"/>
+          <w:sz w:val="32"/>
+          <w:szCs w:val="32"/>
+        </w:rPr>
+        <w:t>utiliser</w:t>
+      </w:r>
+      <w:proofErr w:type="spellEnd"/>
+      <w:r>
+        <w:rPr>
+          <w:b/>
+          <w:bCs/>
+          <w:i/>
+          <w:iCs/>
+          <w:color w:val="C00000"/>
+          <w:sz w:val="32"/>
+          <w:szCs w:val="32"/>
+        </w:rPr>
+        <w:t xml:space="preserve"> le préfixe produit car c'est celui qui permets d'avoir accès aux propriétés  de cette classe j'ai aussi changé le </w:t>
+      </w:r>
+      <w:proofErr w:type="spellStart"/>
+      <w:r>
+        <w:rPr>
+          <w:b/>
+          <w:bCs/>
+          <w:i/>
+          <w:iCs/>
+          <w:color w:val="C00000"/>
+          <w:sz w:val="32"/>
+          <w:szCs w:val="32"/>
+        </w:rPr>
+        <w:t>asp</w:t>
+      </w:r>
+      <w:proofErr w:type="spellEnd"/>
+      <w:r>
+        <w:rPr>
+          <w:b/>
+          <w:bCs/>
+          <w:i/>
+          <w:iCs/>
+          <w:color w:val="C00000"/>
+          <w:sz w:val="32"/>
+          <w:szCs w:val="32"/>
+        </w:rPr>
+        <w:t xml:space="preserve"> items pour </w:t>
+      </w:r>
+      <w:proofErr w:type="spellStart"/>
+      <w:r>
+        <w:rPr>
+          <w:b/>
+          <w:bCs/>
+          <w:i/>
+          <w:iCs/>
+          <w:color w:val="C00000"/>
+          <w:sz w:val="32"/>
+          <w:szCs w:val="32"/>
+        </w:rPr>
+        <w:t>Model.CategorieList</w:t>
+      </w:r>
+      <w:proofErr w:type="spellEnd"/>
+      <w:r>
+        <w:rPr>
+          <w:b/>
+          <w:bCs/>
+          <w:i/>
+          <w:iCs/>
+          <w:color w:val="C00000"/>
+          <w:sz w:val="32"/>
+          <w:szCs w:val="32"/>
+        </w:rPr>
+        <w:t xml:space="preserve"> afin d'afficher la liste des catégories . Dans mon </w:t>
+      </w:r>
+      <w:proofErr w:type="spellStart"/>
+      <w:r>
+        <w:rPr>
+          <w:b/>
+          <w:bCs/>
+          <w:i/>
+          <w:iCs/>
+          <w:color w:val="C00000"/>
+          <w:sz w:val="32"/>
+          <w:szCs w:val="32"/>
+        </w:rPr>
+        <w:t>controller</w:t>
+      </w:r>
+      <w:proofErr w:type="spellEnd"/>
+      <w:r>
+        <w:rPr>
+          <w:b/>
+          <w:bCs/>
+          <w:i/>
+          <w:iCs/>
+          <w:color w:val="C00000"/>
+          <w:sz w:val="32"/>
+          <w:szCs w:val="32"/>
+        </w:rPr>
+        <w:t xml:space="preserve"> j'ai modifié mon post </w:t>
+      </w:r>
+      <w:proofErr w:type="spellStart"/>
+      <w:r>
+        <w:rPr>
+          <w:b/>
+          <w:bCs/>
+          <w:i/>
+          <w:iCs/>
+          <w:color w:val="C00000"/>
+          <w:sz w:val="32"/>
+          <w:szCs w:val="32"/>
+        </w:rPr>
+        <w:t>Create</w:t>
+      </w:r>
+      <w:proofErr w:type="spellEnd"/>
+      <w:r>
+        <w:rPr>
+          <w:b/>
+          <w:bCs/>
+          <w:i/>
+          <w:iCs/>
+          <w:color w:val="C00000"/>
+          <w:sz w:val="32"/>
+          <w:szCs w:val="32"/>
+        </w:rPr>
+        <w:t xml:space="preserve"> car lorsque j'appuie sur le bouton il reset automatiquement tout la liste mais j'ai </w:t>
+      </w:r>
+      <w:proofErr w:type="spellStart"/>
+      <w:r>
+        <w:rPr>
+          <w:b/>
+          <w:bCs/>
+          <w:i/>
+          <w:iCs/>
+          <w:color w:val="C00000"/>
+          <w:sz w:val="32"/>
+          <w:szCs w:val="32"/>
+        </w:rPr>
+        <w:t>fais</w:t>
+      </w:r>
+      <w:proofErr w:type="spellEnd"/>
+      <w:r>
+        <w:rPr>
+          <w:b/>
+          <w:bCs/>
+          <w:i/>
+          <w:iCs/>
+          <w:color w:val="C00000"/>
+          <w:sz w:val="32"/>
+          <w:szCs w:val="32"/>
+        </w:rPr>
+        <w:t xml:space="preserve"> en sorte qu'elle reste en permanence.</w:t>
       </w:r>
     </w:p>
     <w:p>
@@ -8175,6 +8387,7 @@
   <w:style w:type="character" w:default="1" w:styleId="Policepardfaut">
     <w:name w:val="Default Paragraph Font"/>
     <w:uiPriority w:val="1"/>
+    <w:semiHidden/>
     <w:unhideWhenUsed/>
   </w:style>
   <w:style w:type="table" w:default="1" w:styleId="TableauNormal">
@@ -9153,6 +9366,15 @@
 </file>
 
 <file path=customXml/item2.xml><?xml version="1.0" encoding="utf-8"?>
+<?mso-contentType ?>
+<FormTemplates xmlns="http://schemas.microsoft.com/sharepoint/v3/contenttype/forms">
+  <Display>DocumentLibraryForm</Display>
+  <Edit>DocumentLibraryForm</Edit>
+  <New>DocumentLibraryForm</New>
+</FormTemplates>
+</file>
+
+<file path=customXml/item3.xml><?xml version="1.0" encoding="utf-8"?>
 <ct:contentTypeSchema xmlns:ct="http://schemas.microsoft.com/office/2006/metadata/contentType" xmlns:ma="http://schemas.microsoft.com/office/2006/metadata/properties/metaAttributes" ct:_="" ma:_="" ma:contentTypeName="Document" ma:contentTypeID="0x010100354AEAE9FD62D747A26A546E5B1B5735" ma:contentTypeVersion="7" ma:contentTypeDescription="Crée un document." ma:contentTypeScope="" ma:versionID="43b763fe9aa20b7a2976a5e019d82dbf">
   <xsd:schema xmlns:xsd="http://www.w3.org/2001/XMLSchema" xmlns:xs="http://www.w3.org/2001/XMLSchema" xmlns:p="http://schemas.microsoft.com/office/2006/metadata/properties" xmlns:ns2="071933db-0376-4694-9786-b56cb37c4ec2" targetNamespace="http://schemas.microsoft.com/office/2006/metadata/properties" ma:root="true" ma:fieldsID="d5c90ae6c1ec6ed317c9f5feddaf7a33" ns2:_="">
     <xsd:import namespace="071933db-0376-4694-9786-b56cb37c4ec2"/>
@@ -9316,15 +9538,6 @@
 </ct:contentTypeSchema>
 </file>
 
-<file path=customXml/item3.xml><?xml version="1.0" encoding="utf-8"?>
-<?mso-contentType ?>
-<FormTemplates xmlns="http://schemas.microsoft.com/sharepoint/v3/contenttype/forms">
-  <Display>DocumentLibraryForm</Display>
-  <Edit>DocumentLibraryForm</Edit>
-  <New>DocumentLibraryForm</New>
-</FormTemplates>
-</file>
-
 <file path=customXml/itemProps1.xml><?xml version="1.0" encoding="utf-8"?>
 <ds:datastoreItem xmlns:ds="http://schemas.openxmlformats.org/officeDocument/2006/customXml" ds:itemID="{2C36E056-BA2C-4A1F-9580-242C9B36FE70}">
   <ds:schemaRefs>
@@ -9335,6 +9548,14 @@
 </file>
 
 <file path=customXml/itemProps2.xml><?xml version="1.0" encoding="utf-8"?>
+<ds:datastoreItem xmlns:ds="http://schemas.openxmlformats.org/officeDocument/2006/customXml" ds:itemID="{F6194C16-5FE5-4670-BEC8-3D6DD9380312}">
+  <ds:schemaRefs>
+    <ds:schemaRef ds:uri="http://schemas.microsoft.com/sharepoint/v3/contenttype/forms"/>
+  </ds:schemaRefs>
+</ds:datastoreItem>
+</file>
+
+<file path=customXml/itemProps3.xml><?xml version="1.0" encoding="utf-8"?>
 <ds:datastoreItem xmlns:ds="http://schemas.openxmlformats.org/officeDocument/2006/customXml" ds:itemID="{5C3A06EC-DC03-4D65-AA15-C6B9D68C1ED0}">
   <ds:schemaRefs>
     <ds:schemaRef ds:uri="http://schemas.microsoft.com/office/2006/metadata/contentType"/>
@@ -9350,12 +9571,4 @@
     <ds:schemaRef ds:uri="http://schemas.microsoft.com/internal/obd"/>
   </ds:schemaRefs>
 </ds:datastoreItem>
-</file>
-
-<file path=customXml/itemProps3.xml><?xml version="1.0" encoding="utf-8"?>
-<ds:datastoreItem xmlns:ds="http://schemas.openxmlformats.org/officeDocument/2006/customXml" ds:itemID="{F6194C16-5FE5-4670-BEC8-3D6DD9380312}">
-  <ds:schemaRefs>
-    <ds:schemaRef ds:uri="http://schemas.microsoft.com/sharepoint/v3/contenttype/forms"/>
-  </ds:schemaRefs>
-</ds:datastoreItem>
 </file>
</xml_diff>